<commit_message>
Publish organization dashboard and manuscript v0.5.0
</commit_message>
<xml_diff>
--- a/paper/editions/active_inference_battleship.docx
+++ b/paper/editions/active_inference_battleship.docx
@@ -76,7 +76,7 @@
             <w:rStyle w:val="Hyperlink"/>
             <w:lang w:val="en-US"/>
           </w:rPr>
-          <w:t xml:space="preserve">DOI 10.5281/zenodo.23670188</w:t>
+          <w:t xml:space="preserve">DOI 10.5281/zenodo.23676081</w:t>
         </w:r>
       </w:hyperlink>
       <w:r>
@@ -103,7 +103,7 @@
             <w:rStyle w:val="Hyperlink"/>
             <w:lang w:val="en-US"/>
           </w:rPr>
-          <w:t xml:space="preserve">GitHub v0.4.0</w:t>
+          <w:t xml:space="preserve">GitHub v0.5.0</w:t>
         </w:r>
       </w:hyperlink>
     </w:p>
@@ -175,7 +175,7 @@
           <w:bCs/>
           <w:lang w:val="en-US"/>
         </w:rPr>
-        <w:t xml:space="preserve">Version 0.4.0 from the Active Inference Institute.</w:t>
+        <w:t xml:space="preserve">Version 0.5.0 from the Active Inference Institute.</w:t>
       </w:r>
       <w:r>
         <w:rPr>
@@ -436,7 +436,7 @@
         <w:rPr>
           <w:lang w:val="en-US"/>
         </w:rPr>
-        <w:t xml:space="preserve">A typed core package and headless replay-analysis commands support reuse outside the browser. The Active Inference Institute publishes version 0.4.0 with source and reproducibility materials at</w:t>
+        <w:t xml:space="preserve">A typed core package and headless replay-analysis commands support reuse outside the browser. The Active Inference Institute publishes version 0.5.0 with source and reproducibility materials at</w:t>
       </w:r>
       <w:r>
         <w:rPr>
@@ -450,7 +450,7 @@
             <w:rStyle w:val="Hyperlink"/>
             <w:lang w:val="en-US"/>
           </w:rPr>
-          <w:t xml:space="preserve">ActInfInstitute/active_inference_battleship</w:t>
+          <w:t xml:space="preserve">the Institute’s public Battleship repository</w:t>
         </w:r>
       </w:hyperlink>
       <w:r>
@@ -477,7 +477,7 @@
             <w:rStyle w:val="Hyperlink"/>
             <w:lang w:val="en-US"/>
           </w:rPr>
-          <w:t xml:space="preserve">Zenodo, DOI 10.5281/zenodo.23670188</w:t>
+          <w:t xml:space="preserve">Zenodo, DOI 10.5281/zenodo.23676081</w:t>
         </w:r>
       </w:hyperlink>
       <w:r>
@@ -511,7 +511,7 @@
         <w:rPr>
           <w:lang w:val="en-US"/>
         </w:rPr>
-        <w:t xml:space="preserve">distributes the manuscript, interactive reader, dashboard, and reusable core package.</w:t>
+        <w:t xml:space="preserve">distributes the manuscript, interactive reader, dashboard, reusable core package, and a captioned 20-minute explanatory video with slides and transcript.</w:t>
       </w:r>
     </w:p>
     <w:p>
@@ -6585,7 +6585,7 @@
         <w:rPr>
           <w:lang w:val="en-US"/>
         </w:rPr>
-        <w:t xml:space="preserve">A separate typed ESM package exposes the core without browser, worker, Bun, or Python runtime imports. Its bundled default model is the already checked GNN compilation; consumption does not execute arbitrary GNN or revalidate a remote source. Headless commands run the actual two-actor game to a resumable replay or analyze either actor’s public observations with explicit temporary control overrides. These competitive games are distinct from the single-fleet demonstration below. Analysis reports are also distinct from replay files: they preserve impossible log weights with an explicit negative-infinity string instead of JSON’s silent conversion to null, and reject unexpected nonfinite values. CLI analysis reports record their runtime/version. Version-one replays carry no producer metadata and recompute opponent actions; retain the producing runtime separately and compare reconstructed histories when moving between engines. Final floating-point bits and near-tied choices can differ between engines. Source/artifact receipts and real Node, Bun, TypeScript-consumer, and local-archive checks support reuse; they do not establish scientific efficacy. Version 0.4.0 is publicly distributed through the release and archive identified below.</w:t>
+        <w:t xml:space="preserve">A separate typed ESM package exposes the core without browser, worker, Bun, or Python runtime imports. Its bundled default model is the already checked GNN compilation; consumption does not execute arbitrary GNN or revalidate a remote source. Headless commands run the actual two-actor game to a resumable replay or analyze either actor’s public observations with explicit temporary control overrides. These competitive games are distinct from the single-fleet demonstration below. Analysis reports are also distinct from replay files: they preserve impossible log weights with an explicit negative-infinity string instead of JSON’s silent conversion to null, and reject unexpected nonfinite values. CLI analysis reports record their runtime/version. Version-one replays carry no producer metadata and recompute opponent actions; retain the producing runtime separately and compare reconstructed histories when moving between engines. Final floating-point bits and near-tied choices can differ between engines. Source/artifact receipts and real Node, Bun, TypeScript-consumer, and local-archive checks support reuse; they do not establish scientific efficacy. Version 0.5.0 is publicly distributed through the release and archive identified below.</w:t>
       </w:r>
     </w:p>
     <w:p>
@@ -13841,7 +13841,7 @@
         <w:rPr>
           <w:lang w:val="en-US"/>
         </w:rPr>
-        <w:t xml:space="preserve">. Numerical correctness, browser operation, document rendering, empirical efficacy, and publication approval remain separate claims. This manuscript reports software and a bounded computational demonstration. Version 0.4.0 makes the source, manuscript, and reproducibility materials publicly available; publication does not add an empirical efficacy claim.</w:t>
+        <w:t xml:space="preserve">. Numerical correctness, browser operation, document rendering, empirical efficacy, and publication approval remain separate claims. This manuscript reports software and a bounded computational demonstration. Version 0.5.0 makes the source, manuscript, and reproducibility materials publicly available; publication does not add an empirical efficacy claim.</w:t>
       </w:r>
     </w:p>
     <w:p>
@@ -13879,7 +13879,7 @@
             <w:rStyle w:val="Hyperlink"/>
             <w:lang w:val="en-US"/>
           </w:rPr>
-          <w:t xml:space="preserve">ActInfInstitute/active_inference_battleship</w:t>
+          <w:t xml:space="preserve">the Institute’s public Battleship repository</w:t>
         </w:r>
       </w:hyperlink>
       <w:r>
@@ -13900,7 +13900,7 @@
             <w:rStyle w:val="Hyperlink"/>
             <w:lang w:val="en-US"/>
           </w:rPr>
-          <w:t xml:space="preserve">v0.4.0 release</w:t>
+          <w:t xml:space="preserve">v0.5.0 release</w:t>
         </w:r>
       </w:hyperlink>
       <w:r>
@@ -13921,7 +13921,7 @@
             <w:rStyle w:val="Hyperlink"/>
             <w:lang w:val="en-US"/>
           </w:rPr>
-          <w:t xml:space="preserve">Zenodo, DOI 10.5281/zenodo.23670188</w:t>
+          <w:t xml:space="preserve">Zenodo, DOI 10.5281/zenodo.23676081</w:t>
         </w:r>
       </w:hyperlink>
       <w:r>
@@ -13986,6 +13986,17 @@
           <w:lang w:val="en-US"/>
         </w:rPr>
         <w:t xml:space="preserve">Next experiments should use held-out fleet generators and compare contingent planning under matched observations and computation budgets. A separate learner study is needed before making claims about educational benefit.</w:t>
+      </w:r>
+    </w:p>
+    <w:p>
+      <w:pPr>
+        <w:pStyle w:val="BodyText"/>
+      </w:pPr>
+      <w:r>
+        <w:rPr>
+          <w:lang w:val="en-US"/>
+        </w:rPr>
+        <w:t xml:space="preserve">Version 0.5.0 is the organization and visual-explanation edition. The existing repository was transferred to the ActiveInferenceInstitute organization, retaining its history and prior release. Current metadata and the Pages site use the organization address; the initial manuscript deposit remains available under its original DOI. A narrated 20-minute lecture, captioned video, slides, transcript, and source ledger accompany this version’s release. The additional diagrams and motion explain retained quantities and software boundaries; they do not add experimental cases or renew scientific efficacy claims.</w:t>
       </w:r>
     </w:p>
     <w:bookmarkStart w:id="114" w:name="_references"/>

</xml_diff>